<commit_message>
Restructure the deck as a step by step walk-through
Each of Steps 1 to 6 now gets its own slide showing four things together:
what the step required, the survey questions exactly as the form asked them,
how the answers were turned into a number, and what came out. A roadmap slide
opens the sequence and a completion slide closes it.

Both renderers gain one generic block-column layout, so a slide is now a list
of blocks with explicit heights and the pptx and pdf agree by construction.
Three engine figure titles and two annotations were reworded to describe what
the instrument measures rather than what it leaves out.
</commit_message>
<xml_diff>
--- a/report/MBA680_Steps1to6_Report.docx
+++ b/report/MBA680_Steps1to6_Report.docx
@@ -3369,7 +3369,7 @@
       <w:r>
         <w:drawing>
           <wp:inline distT="0" distB="0" distL="0" distR="0">
-            <wp:extent cx="4457700" cy="1695450"/>
+            <wp:extent cx="4457700" cy="1619250"/>
             <wp:effectExtent t="0" r="0" b="0" l="0"/>
             <wp:docPr id="1" name="" descr="" title=""/>
             <wp:cNvGraphicFramePr>
@@ -3394,7 +3394,7 @@
                   <pic:spPr bwMode="auto">
                     <a:xfrm>
                       <a:off x="0" y="0"/>
-                      <a:ext cx="4457700" cy="1695450"/>
+                      <a:ext cx="4457700" cy="1619250"/>
                     </a:xfrm>
                     <a:prstGeom prst="rect">
                       <a:avLst/>
@@ -9253,7 +9253,7 @@
       <w:r>
         <w:drawing>
           <wp:inline distT="0" distB="0" distL="0" distR="0">
-            <wp:extent cx="4457700" cy="2590800"/>
+            <wp:extent cx="4457700" cy="2257425"/>
             <wp:effectExtent t="0" r="0" b="0" l="0"/>
             <wp:docPr id="1" name="" descr="" title=""/>
             <wp:cNvGraphicFramePr>
@@ -9278,7 +9278,7 @@
                   <pic:spPr bwMode="auto">
                     <a:xfrm>
                       <a:off x="0" y="0"/>
-                      <a:ext cx="4457700" cy="2590800"/>
+                      <a:ext cx="4457700" cy="2257425"/>
                     </a:xfrm>
                     <a:prstGeom prst="rect">
                       <a:avLst/>
@@ -9315,7 +9315,7 @@
       <w:r>
         <w:drawing>
           <wp:inline distT="0" distB="0" distL="0" distR="0">
-            <wp:extent cx="4457700" cy="2085975"/>
+            <wp:extent cx="4457700" cy="2066925"/>
             <wp:effectExtent t="0" r="0" b="0" l="0"/>
             <wp:docPr id="1" name="" descr="" title=""/>
             <wp:cNvGraphicFramePr>
@@ -9340,7 +9340,7 @@
                   <pic:spPr bwMode="auto">
                     <a:xfrm>
                       <a:off x="0" y="0"/>
-                      <a:ext cx="4457700" cy="2085975"/>
+                      <a:ext cx="4457700" cy="2066925"/>
                     </a:xfrm>
                     <a:prstGeom prst="rect">
                       <a:avLst/>

</xml_diff>